<commit_message>
Update capstone proposal document
</commit_message>
<xml_diff>
--- a/docs/CSE598-Project-Janus-Proposal.docx
+++ b/docs/CSE598-Project-Janus-Proposal.docx
@@ -146,7 +146,7 @@
                 <w:rFonts w:ascii="Calibri" w:hAnsi="Calibri"/>
                 <w:sz w:val="20"/>
               </w:rPr>
-              <w:t>Local project folder: Agentic AI (push to course repo or GitHub and replace this line before submit)</w:t>
+              <w:t>https://github.com/Pun33t-B0kk4/project-janus_aswa</w:t>
             </w:r>
           </w:p>
         </w:tc>
@@ -206,7 +206,39 @@
           <w:rFonts w:ascii="Calibri" w:hAnsi="Calibri"/>
           <w:sz w:val="21"/>
         </w:rPr>
-        <w:t>Task. Build ASWA, a closed-loop defensive system for enterprise operations tooling. Live production (the Light World) is never attacked directly. Instead the system discovers risk inside an isolated Shadow-World twin and returns only validated defenses through the Janus Gate. Another person can judge success by whether unsafe actions are blocked in production after deploy, while secrets and attack payloads never leave the twin.</w:t>
+        <w:t xml:space="preserve">Task. Build ASWA, a closed-loop defensive system for enterprise operations tooling. Live production (the Light World) is never attacked directly. </w:t>
+      </w:r>
+      <w:proofErr w:type="gramStart"/>
+      <w:r>
+        <w:rPr>
+          <w:rFonts w:ascii="Calibri" w:hAnsi="Calibri"/>
+          <w:sz w:val="21"/>
+        </w:rPr>
+        <w:t>Instead</w:t>
+      </w:r>
+      <w:proofErr w:type="gramEnd"/>
+      <w:r>
+        <w:rPr>
+          <w:rFonts w:ascii="Calibri" w:hAnsi="Calibri"/>
+          <w:sz w:val="21"/>
+        </w:rPr>
+        <w:t xml:space="preserve"> the system discovers risk inside an isolated Shadow-World twin and returns only validated defenses through the Janus Gate. Another person can judge success by whether unsafe actions are blocked in production after </w:t>
+      </w:r>
+      <w:proofErr w:type="gramStart"/>
+      <w:r>
+        <w:rPr>
+          <w:rFonts w:ascii="Calibri" w:hAnsi="Calibri"/>
+          <w:sz w:val="21"/>
+        </w:rPr>
+        <w:t>deploy</w:t>
+      </w:r>
+      <w:proofErr w:type="gramEnd"/>
+      <w:r>
+        <w:rPr>
+          <w:rFonts w:ascii="Calibri" w:hAnsi="Calibri"/>
+          <w:sz w:val="21"/>
+        </w:rPr>
+        <w:t>, while secrets and attack payloads never leave the twin.</w:t>
       </w:r>
     </w:p>
     <w:p>
@@ -377,7 +409,23 @@
           <w:rFonts w:ascii="Calibri" w:hAnsi="Calibri"/>
           <w:sz w:val="21"/>
         </w:rPr>
-        <w:t>Sanitized twin, confined attack report, designed countermeasures, Gate decisions, and installed defensive patches.</w:t>
+        <w:t xml:space="preserve">Sanitized twin, confined attack report, designed countermeasures, </w:t>
+      </w:r>
+      <w:proofErr w:type="gramStart"/>
+      <w:r>
+        <w:rPr>
+          <w:rFonts w:ascii="Calibri" w:hAnsi="Calibri"/>
+          <w:sz w:val="21"/>
+        </w:rPr>
+        <w:t>Gate</w:t>
+      </w:r>
+      <w:proofErr w:type="gramEnd"/>
+      <w:r>
+        <w:rPr>
+          <w:rFonts w:ascii="Calibri" w:hAnsi="Calibri"/>
+          <w:sz w:val="21"/>
+        </w:rPr>
+        <w:t xml:space="preserve"> decisions, and installed defensive patches.</w:t>
       </w:r>
     </w:p>
     <w:p>
@@ -445,7 +493,55 @@
           <w:rFonts w:ascii="Calibri" w:hAnsi="Calibri"/>
           <w:sz w:val="21"/>
         </w:rPr>
-        <w:t>Static pen-tests go stale as systems change, while continuous red-teaming of live production is operationally unsafe. ASWA is worth building because it provides continuous adversarial pressure without placing attack execution in production. An agentic design is appropriate because ASWA is a multi-component workflow with conflicting incentives: faithful sanitized mirroring (RME), aggressive shadow probing (ASA), and conservative one-way export control (Janus Gate). This is feasible for a semester project because the Light World can be a local FastAPI simulator, while the architectural invariants remain meaningful and evaluable.</w:t>
+        <w:t xml:space="preserve">Static pen-tests go stale as systems change, while continuous red-teaming of live production is operationally unsafe. ASWA is worth building because it provides continuous adversarial pressure without placing attack execution in production. An agentic design is appropriate because ASWA is a multi-component workflow with conflicting incentives: </w:t>
+      </w:r>
+      <w:proofErr w:type="gramStart"/>
+      <w:r>
+        <w:rPr>
+          <w:rFonts w:ascii="Calibri" w:hAnsi="Calibri"/>
+          <w:sz w:val="21"/>
+        </w:rPr>
+        <w:t>faithful sanitized</w:t>
+      </w:r>
+      <w:proofErr w:type="gramEnd"/>
+      <w:r>
+        <w:rPr>
+          <w:rFonts w:ascii="Calibri" w:hAnsi="Calibri"/>
+          <w:sz w:val="21"/>
+        </w:rPr>
+        <w:t xml:space="preserve"> mirroring (RME), aggressive shadow probing (ASA), and conservative one-way export control (Janus Gate). This is feasible for a semester project because </w:t>
+      </w:r>
+      <w:proofErr w:type="gramStart"/>
+      <w:r>
+        <w:rPr>
+          <w:rFonts w:ascii="Calibri" w:hAnsi="Calibri"/>
+          <w:sz w:val="21"/>
+        </w:rPr>
+        <w:t>the Light</w:t>
+      </w:r>
+      <w:proofErr w:type="gramEnd"/>
+      <w:r>
+        <w:rPr>
+          <w:rFonts w:ascii="Calibri" w:hAnsi="Calibri"/>
+          <w:sz w:val="21"/>
+        </w:rPr>
+        <w:t xml:space="preserve"> World can be a local </w:t>
+      </w:r>
+      <w:proofErr w:type="spellStart"/>
+      <w:r>
+        <w:rPr>
+          <w:rFonts w:ascii="Calibri" w:hAnsi="Calibri"/>
+          <w:sz w:val="21"/>
+        </w:rPr>
+        <w:t>FastAPI</w:t>
+      </w:r>
+      <w:proofErr w:type="spellEnd"/>
+      <w:r>
+        <w:rPr>
+          <w:rFonts w:ascii="Calibri" w:hAnsi="Calibri"/>
+          <w:sz w:val="21"/>
+        </w:rPr>
+        <w:t xml:space="preserve"> simulator, while the architectural invariants remain meaningful and evaluable.</w:t>
       </w:r>
     </w:p>
     <w:p>
@@ -470,7 +566,23 @@
           <w:rFonts w:ascii="Calibri" w:hAnsi="Calibri"/>
           <w:sz w:val="21"/>
         </w:rPr>
-        <w:t>Acme Ops Light World (FastAPI) with tickets, ACLs, restricted files, email, and payments.</w:t>
+        <w:t>Acme Ops Light World (</w:t>
+      </w:r>
+      <w:proofErr w:type="spellStart"/>
+      <w:r>
+        <w:rPr>
+          <w:rFonts w:ascii="Calibri" w:hAnsi="Calibri"/>
+          <w:sz w:val="21"/>
+        </w:rPr>
+        <w:t>FastAPI</w:t>
+      </w:r>
+      <w:proofErr w:type="spellEnd"/>
+      <w:r>
+        <w:rPr>
+          <w:rFonts w:ascii="Calibri" w:hAnsi="Calibri"/>
+          <w:sz w:val="21"/>
+        </w:rPr>
+        <w:t>) with tickets, ACLs, restricted files, email, and payments.</w:t>
       </w:r>
     </w:p>
     <w:p>
@@ -534,7 +646,23 @@
           <w:rFonts w:ascii="Calibri" w:hAnsi="Calibri"/>
           <w:sz w:val="21"/>
         </w:rPr>
-        <w:t>Production-scale Kafka/gRPC fabrics, hardware/hypervisor airgaps, and attacks on third-party systems.</w:t>
+        <w:t>Production-scale Kafka/</w:t>
+      </w:r>
+      <w:proofErr w:type="spellStart"/>
+      <w:r>
+        <w:rPr>
+          <w:rFonts w:ascii="Calibri" w:hAnsi="Calibri"/>
+          <w:sz w:val="21"/>
+        </w:rPr>
+        <w:t>gRPC</w:t>
+      </w:r>
+      <w:proofErr w:type="spellEnd"/>
+      <w:r>
+        <w:rPr>
+          <w:rFonts w:ascii="Calibri" w:hAnsi="Calibri"/>
+          <w:sz w:val="21"/>
+        </w:rPr>
+        <w:t xml:space="preserve"> fabrics, hardware/hypervisor airgaps, and attacks on third-party systems.</w:t>
       </w:r>
     </w:p>
     <w:p>
@@ -599,7 +727,55 @@
           <w:rFonts w:ascii="Calibri" w:hAnsi="Calibri"/>
           <w:sz w:val="21"/>
         </w:rPr>
-        <w:t>Optional web demo stack: fastapi, uvicorn, httpx (requirements.txt).</w:t>
+        <w:t xml:space="preserve">Optional web demo stack: </w:t>
+      </w:r>
+      <w:proofErr w:type="spellStart"/>
+      <w:r>
+        <w:rPr>
+          <w:rFonts w:ascii="Calibri" w:hAnsi="Calibri"/>
+          <w:sz w:val="21"/>
+        </w:rPr>
+        <w:t>fastapi</w:t>
+      </w:r>
+      <w:proofErr w:type="spellEnd"/>
+      <w:r>
+        <w:rPr>
+          <w:rFonts w:ascii="Calibri" w:hAnsi="Calibri"/>
+          <w:sz w:val="21"/>
+        </w:rPr>
+        <w:t xml:space="preserve">, </w:t>
+      </w:r>
+      <w:proofErr w:type="spellStart"/>
+      <w:r>
+        <w:rPr>
+          <w:rFonts w:ascii="Calibri" w:hAnsi="Calibri"/>
+          <w:sz w:val="21"/>
+        </w:rPr>
+        <w:t>uvicorn</w:t>
+      </w:r>
+      <w:proofErr w:type="spellEnd"/>
+      <w:r>
+        <w:rPr>
+          <w:rFonts w:ascii="Calibri" w:hAnsi="Calibri"/>
+          <w:sz w:val="21"/>
+        </w:rPr>
+        <w:t xml:space="preserve">, </w:t>
+      </w:r>
+      <w:proofErr w:type="spellStart"/>
+      <w:r>
+        <w:rPr>
+          <w:rFonts w:ascii="Calibri" w:hAnsi="Calibri"/>
+          <w:sz w:val="21"/>
+        </w:rPr>
+        <w:t>httpx</w:t>
+      </w:r>
+      <w:proofErr w:type="spellEnd"/>
+      <w:r>
+        <w:rPr>
+          <w:rFonts w:ascii="Calibri" w:hAnsi="Calibri"/>
+          <w:sz w:val="21"/>
+        </w:rPr>
+        <w:t xml:space="preserve"> (requirements.txt).</w:t>
       </w:r>
     </w:p>
     <w:p>
@@ -645,7 +821,23 @@
           <w:rFonts w:ascii="Calibri" w:hAnsi="Calibri"/>
           <w:sz w:val="21"/>
         </w:rPr>
-        <w:t>Read telemetry and N from examples/test_unsafe.json (CLI) or live Acme Ops telemetry (web).</w:t>
+        <w:t>Read telemetry and N from examples/</w:t>
+      </w:r>
+      <w:proofErr w:type="spellStart"/>
+      <w:r>
+        <w:rPr>
+          <w:rFonts w:ascii="Calibri" w:hAnsi="Calibri"/>
+          <w:sz w:val="21"/>
+        </w:rPr>
+        <w:t>test_unsafe.json</w:t>
+      </w:r>
+      <w:proofErr w:type="spellEnd"/>
+      <w:r>
+        <w:rPr>
+          <w:rFonts w:ascii="Calibri" w:hAnsi="Calibri"/>
+          <w:sz w:val="21"/>
+        </w:rPr>
+        <w:t xml:space="preserve"> (CLI) or live Acme Ops telemetry (web).</w:t>
       </w:r>
     </w:p>
     <w:p>
@@ -754,7 +946,87 @@
           <w:rFonts w:ascii="Calibri" w:hAnsi="Calibri"/>
           <w:sz w:val="21"/>
         </w:rPr>
-        <w:t>run_baseline.py, aswa/rme.py, aswa/asa.py, aswa/learn.py, aswa/janus_gate.py, aswa/pipeline.py, aswa/world.py</w:t>
+        <w:t xml:space="preserve">run_baseline.py, </w:t>
+      </w:r>
+      <w:proofErr w:type="spellStart"/>
+      <w:r>
+        <w:rPr>
+          <w:rFonts w:ascii="Calibri" w:hAnsi="Calibri"/>
+          <w:sz w:val="21"/>
+        </w:rPr>
+        <w:t>aswa</w:t>
+      </w:r>
+      <w:proofErr w:type="spellEnd"/>
+      <w:r>
+        <w:rPr>
+          <w:rFonts w:ascii="Calibri" w:hAnsi="Calibri"/>
+          <w:sz w:val="21"/>
+        </w:rPr>
+        <w:t xml:space="preserve">/rme.py, </w:t>
+      </w:r>
+      <w:proofErr w:type="spellStart"/>
+      <w:r>
+        <w:rPr>
+          <w:rFonts w:ascii="Calibri" w:hAnsi="Calibri"/>
+          <w:sz w:val="21"/>
+        </w:rPr>
+        <w:t>aswa</w:t>
+      </w:r>
+      <w:proofErr w:type="spellEnd"/>
+      <w:r>
+        <w:rPr>
+          <w:rFonts w:ascii="Calibri" w:hAnsi="Calibri"/>
+          <w:sz w:val="21"/>
+        </w:rPr>
+        <w:t xml:space="preserve">/asa.py, </w:t>
+      </w:r>
+      <w:proofErr w:type="spellStart"/>
+      <w:r>
+        <w:rPr>
+          <w:rFonts w:ascii="Calibri" w:hAnsi="Calibri"/>
+          <w:sz w:val="21"/>
+        </w:rPr>
+        <w:t>aswa</w:t>
+      </w:r>
+      <w:proofErr w:type="spellEnd"/>
+      <w:r>
+        <w:rPr>
+          <w:rFonts w:ascii="Calibri" w:hAnsi="Calibri"/>
+          <w:sz w:val="21"/>
+        </w:rPr>
+        <w:t xml:space="preserve">/learn.py, </w:t>
+      </w:r>
+      <w:proofErr w:type="spellStart"/>
+      <w:r>
+        <w:rPr>
+          <w:rFonts w:ascii="Calibri" w:hAnsi="Calibri"/>
+          <w:sz w:val="21"/>
+        </w:rPr>
+        <w:t>aswa</w:t>
+      </w:r>
+      <w:proofErr w:type="spellEnd"/>
+      <w:r>
+        <w:rPr>
+          <w:rFonts w:ascii="Calibri" w:hAnsi="Calibri"/>
+          <w:sz w:val="21"/>
+        </w:rPr>
+        <w:t xml:space="preserve">/janus_gate.py, </w:t>
+      </w:r>
+      <w:proofErr w:type="spellStart"/>
+      <w:r>
+        <w:rPr>
+          <w:rFonts w:ascii="Calibri" w:hAnsi="Calibri"/>
+          <w:sz w:val="21"/>
+        </w:rPr>
+        <w:t>aswa</w:t>
+      </w:r>
+      <w:proofErr w:type="spellEnd"/>
+      <w:r>
+        <w:rPr>
+          <w:rFonts w:ascii="Calibri" w:hAnsi="Calibri"/>
+          <w:sz w:val="21"/>
+        </w:rPr>
+        <w:t>/pipeline.py, aswa/world.py</w:t>
       </w:r>
     </w:p>
     <w:p>
@@ -780,8 +1052,42 @@
           <w:rFonts w:ascii="Calibri" w:hAnsi="Calibri"/>
           <w:sz w:val="21"/>
         </w:rPr>
-        <w:t>Config and examples: examples/readme.md, examples/test_unsafe.json, examples/test_safe.json</w:t>
-      </w:r>
+        <w:t xml:space="preserve">Config and examples: examples/readme.md, </w:t>
+      </w:r>
+      <w:proofErr w:type="gramStart"/>
+      <w:r>
+        <w:rPr>
+          <w:rFonts w:ascii="Calibri" w:hAnsi="Calibri"/>
+          <w:sz w:val="21"/>
+        </w:rPr>
+        <w:t>examples/</w:t>
+      </w:r>
+      <w:proofErr w:type="spellStart"/>
+      <w:r>
+        <w:rPr>
+          <w:rFonts w:ascii="Calibri" w:hAnsi="Calibri"/>
+          <w:sz w:val="21"/>
+        </w:rPr>
+        <w:t>test_unsafe.json</w:t>
+      </w:r>
+      <w:proofErr w:type="spellEnd"/>
+      <w:proofErr w:type="gramEnd"/>
+      <w:r>
+        <w:rPr>
+          <w:rFonts w:ascii="Calibri" w:hAnsi="Calibri"/>
+          <w:sz w:val="21"/>
+        </w:rPr>
+        <w:t>, examples/</w:t>
+      </w:r>
+      <w:proofErr w:type="spellStart"/>
+      <w:r>
+        <w:rPr>
+          <w:rFonts w:ascii="Calibri" w:hAnsi="Calibri"/>
+          <w:sz w:val="21"/>
+        </w:rPr>
+        <w:t>test_safe.json</w:t>
+      </w:r>
+      <w:proofErr w:type="spellEnd"/>
     </w:p>
     <w:p>
       <w:pPr>
@@ -827,8 +1133,17 @@
           <w:rFonts w:ascii="Calibri" w:hAnsi="Calibri"/>
           <w:sz w:val="21"/>
         </w:rPr>
-        <w:t>examples/test_unsafe.json</w:t>
-      </w:r>
+        <w:t>examples/</w:t>
+      </w:r>
+      <w:proofErr w:type="spellStart"/>
+      <w:r>
+        <w:rPr>
+          <w:rFonts w:ascii="Calibri" w:hAnsi="Calibri"/>
+          <w:sz w:val="21"/>
+        </w:rPr>
+        <w:t>test_unsafe.json</w:t>
+      </w:r>
+      <w:proofErr w:type="spellEnd"/>
     </w:p>
     <w:p>
       <w:pPr>
@@ -869,7 +1184,23 @@
           <w:rFonts w:ascii="Calibri" w:hAnsi="Calibri"/>
           <w:sz w:val="21"/>
         </w:rPr>
-        <w:t>Twin is hydrated with secrets redacted. ASA finds shadow policy breaks. Learn designs defenses. Janus Gate deploys patches. payload_escaped=false. Production remains free of ASA side effects.</w:t>
+        <w:t xml:space="preserve">Twin is hydrated with secrets redacted. ASA finds shadow policy breaks. Learn designs defenses. Janus Gate deploys patches. </w:t>
+      </w:r>
+      <w:proofErr w:type="spellStart"/>
+      <w:r>
+        <w:rPr>
+          <w:rFonts w:ascii="Calibri" w:hAnsi="Calibri"/>
+          <w:sz w:val="21"/>
+        </w:rPr>
+        <w:t>payload_escaped</w:t>
+      </w:r>
+      <w:proofErr w:type="spellEnd"/>
+      <w:r>
+        <w:rPr>
+          <w:rFonts w:ascii="Calibri" w:hAnsi="Calibri"/>
+          <w:sz w:val="21"/>
+        </w:rPr>
+        <w:t>=false. Production remains free of ASA side effects.</w:t>
       </w:r>
     </w:p>
     <w:p>
@@ -881,8 +1212,17 @@
           <w:rFonts w:ascii="Calibri" w:hAnsi="Calibri"/>
           <w:sz w:val="21"/>
         </w:rPr>
-        <w:t>Actual baseline output (screenshot). Command used: python run_baseline.py --input examples/test_unsafe.json</w:t>
-      </w:r>
+        <w:t>Actual baseline output (screenshot). Command used: python run_baseline.py --input examples/</w:t>
+      </w:r>
+      <w:proofErr w:type="spellStart"/>
+      <w:r>
+        <w:rPr>
+          <w:rFonts w:ascii="Calibri" w:hAnsi="Calibri"/>
+          <w:sz w:val="21"/>
+        </w:rPr>
+        <w:t>test_unsafe.json</w:t>
+      </w:r>
+      <w:proofErr w:type="spellEnd"/>
     </w:p>
     <w:p>
       <w:pPr>
@@ -941,7 +1281,25 @@
           <w:i/>
           <w:sz w:val="18"/>
         </w:rPr>
-        <w:t>Figure 1. Actual console output from the runnable baseline on examples/test_unsafe.json.</w:t>
+        <w:t>Figure 1. Actual console output from the runnable baseline on examples/</w:t>
+      </w:r>
+      <w:proofErr w:type="spellStart"/>
+      <w:r>
+        <w:rPr>
+          <w:rFonts w:ascii="Calibri" w:hAnsi="Calibri"/>
+          <w:i/>
+          <w:sz w:val="18"/>
+        </w:rPr>
+        <w:t>test_unsafe.json</w:t>
+      </w:r>
+      <w:proofErr w:type="spellEnd"/>
+      <w:r>
+        <w:rPr>
+          <w:rFonts w:ascii="Calibri" w:hAnsi="Calibri"/>
+          <w:i/>
+          <w:sz w:val="18"/>
+        </w:rPr>
+        <w:t>.</w:t>
       </w:r>
     </w:p>
     <w:p>
@@ -962,13 +1320,54 @@
         <w:pStyle w:val="ListBullet"/>
         <w:spacing w:after="20" w:line="252" w:lineRule="auto"/>
       </w:pPr>
+      <w:proofErr w:type="spellStart"/>
       <w:r>
         <w:rPr>
           <w:rFonts w:ascii="Calibri" w:hAnsi="Calibri"/>
           <w:sz w:val="21"/>
         </w:rPr>
         <w:lastRenderedPageBreak/>
-        <w:t>payload_escaped stayed False. Light World remained clean except installed defenses. Full JSON written to examples/last_run.json.</w:t>
+        <w:t>payload_escaped</w:t>
+      </w:r>
+      <w:proofErr w:type="spellEnd"/>
+      <w:r>
+        <w:rPr>
+          <w:rFonts w:ascii="Calibri" w:hAnsi="Calibri"/>
+          <w:sz w:val="21"/>
+        </w:rPr>
+        <w:t xml:space="preserve"> stayed False. Light World remained clean </w:t>
+      </w:r>
+      <w:proofErr w:type="gramStart"/>
+      <w:r>
+        <w:rPr>
+          <w:rFonts w:ascii="Calibri" w:hAnsi="Calibri"/>
+          <w:sz w:val="21"/>
+        </w:rPr>
+        <w:t>except</w:t>
+      </w:r>
+      <w:proofErr w:type="gramEnd"/>
+      <w:r>
+        <w:rPr>
+          <w:rFonts w:ascii="Calibri" w:hAnsi="Calibri"/>
+          <w:sz w:val="21"/>
+        </w:rPr>
+        <w:t xml:space="preserve"> installed defenses. Full JSON written to examples/</w:t>
+      </w:r>
+      <w:proofErr w:type="spellStart"/>
+      <w:r>
+        <w:rPr>
+          <w:rFonts w:ascii="Calibri" w:hAnsi="Calibri"/>
+          <w:sz w:val="21"/>
+        </w:rPr>
+        <w:t>last_run.json</w:t>
+      </w:r>
+      <w:proofErr w:type="spellEnd"/>
+      <w:r>
+        <w:rPr>
+          <w:rFonts w:ascii="Calibri" w:hAnsi="Calibri"/>
+          <w:sz w:val="21"/>
+        </w:rPr>
+        <w:t>.</w:t>
       </w:r>
     </w:p>
     <w:p>
@@ -1108,8 +1507,17 @@
           <w:rFonts w:ascii="Calibri" w:hAnsi="Calibri"/>
           <w:sz w:val="21"/>
         </w:rPr>
-        <w:t>None required for the baseline. Local demo token (web only): Bearer prod-secret-abc</w:t>
-      </w:r>
+        <w:t>None required for the baseline. Local demo token (web only): Bearer prod-secret-</w:t>
+      </w:r>
+      <w:proofErr w:type="spellStart"/>
+      <w:r>
+        <w:rPr>
+          <w:rFonts w:ascii="Calibri" w:hAnsi="Calibri"/>
+          <w:sz w:val="21"/>
+        </w:rPr>
+        <w:t>abc</w:t>
+      </w:r>
+      <w:proofErr w:type="spellEnd"/>
     </w:p>
     <w:p>
       <w:pPr>
@@ -1129,8 +1537,17 @@
           <w:rFonts w:ascii="Calibri" w:hAnsi="Calibri"/>
           <w:sz w:val="21"/>
         </w:rPr>
-        <w:t>python run_baseline.py --input examples/test_unsafe.json</w:t>
-      </w:r>
+        <w:t>python run_baseline.py --input examples/</w:t>
+      </w:r>
+      <w:proofErr w:type="spellStart"/>
+      <w:r>
+        <w:rPr>
+          <w:rFonts w:ascii="Calibri" w:hAnsi="Calibri"/>
+          <w:sz w:val="21"/>
+        </w:rPr>
+        <w:t>test_unsafe.json</w:t>
+      </w:r>
+      <w:proofErr w:type="spellEnd"/>
     </w:p>
     <w:p>
       <w:pPr>
@@ -1171,7 +1588,39 @@
           <w:rFonts w:ascii="Calibri" w:hAnsi="Calibri"/>
           <w:sz w:val="21"/>
         </w:rPr>
-        <w:t>examples/test_unsafe.json (and other examples/*.json use cases)</w:t>
+        <w:t>examples/</w:t>
+      </w:r>
+      <w:proofErr w:type="spellStart"/>
+      <w:r>
+        <w:rPr>
+          <w:rFonts w:ascii="Calibri" w:hAnsi="Calibri"/>
+          <w:sz w:val="21"/>
+        </w:rPr>
+        <w:t>test_unsafe.json</w:t>
+      </w:r>
+      <w:proofErr w:type="spellEnd"/>
+      <w:r>
+        <w:rPr>
+          <w:rFonts w:ascii="Calibri" w:hAnsi="Calibri"/>
+          <w:sz w:val="21"/>
+        </w:rPr>
+        <w:t xml:space="preserve"> (and other examples/*.</w:t>
+      </w:r>
+      <w:proofErr w:type="spellStart"/>
+      <w:r>
+        <w:rPr>
+          <w:rFonts w:ascii="Calibri" w:hAnsi="Calibri"/>
+          <w:sz w:val="21"/>
+        </w:rPr>
+        <w:t>json</w:t>
+      </w:r>
+      <w:proofErr w:type="spellEnd"/>
+      <w:r>
+        <w:rPr>
+          <w:rFonts w:ascii="Calibri" w:hAnsi="Calibri"/>
+          <w:sz w:val="21"/>
+        </w:rPr>
+        <w:t xml:space="preserve"> use cases)</w:t>
       </w:r>
     </w:p>
     <w:p>
@@ -1192,7 +1641,23 @@
           <w:rFonts w:ascii="Calibri" w:hAnsi="Calibri"/>
           <w:sz w:val="21"/>
         </w:rPr>
-        <w:t>Console printout, examples/last_run.json, and web UI Light/Shadow panels</w:t>
+        <w:t>Console printout, examples/</w:t>
+      </w:r>
+      <w:proofErr w:type="spellStart"/>
+      <w:r>
+        <w:rPr>
+          <w:rFonts w:ascii="Calibri" w:hAnsi="Calibri"/>
+          <w:sz w:val="21"/>
+        </w:rPr>
+        <w:t>last_run.json</w:t>
+      </w:r>
+      <w:proofErr w:type="spellEnd"/>
+      <w:r>
+        <w:rPr>
+          <w:rFonts w:ascii="Calibri" w:hAnsi="Calibri"/>
+          <w:sz w:val="21"/>
+        </w:rPr>
+        <w:t>, and web UI Light/Shadow panels</w:t>
       </w:r>
     </w:p>
     <w:p>
@@ -1311,7 +1776,23 @@
           <w:rFonts w:ascii="Calibri" w:hAnsi="Calibri"/>
           <w:sz w:val="21"/>
         </w:rPr>
-        <w:t>Completeness: Learn recall when Attack succeeds or production risk is observed.</w:t>
+        <w:t xml:space="preserve">Completeness: Learn </w:t>
+      </w:r>
+      <w:proofErr w:type="gramStart"/>
+      <w:r>
+        <w:rPr>
+          <w:rFonts w:ascii="Calibri" w:hAnsi="Calibri"/>
+          <w:sz w:val="21"/>
+        </w:rPr>
+        <w:t>recall</w:t>
+      </w:r>
+      <w:proofErr w:type="gramEnd"/>
+      <w:r>
+        <w:rPr>
+          <w:rFonts w:ascii="Calibri" w:hAnsi="Calibri"/>
+          <w:sz w:val="21"/>
+        </w:rPr>
+        <w:t xml:space="preserve"> when Attack succeeds or production risk is observed.</w:t>
       </w:r>
     </w:p>
     <w:p>
@@ -1357,12 +1838,21 @@
       <w:pPr>
         <w:spacing w:after="60" w:line="252" w:lineRule="auto"/>
       </w:pPr>
-      <w:r>
-        <w:rPr>
-          <w:rFonts w:ascii="Calibri" w:hAnsi="Calibri"/>
-          <w:sz w:val="21"/>
-        </w:rPr>
-        <w:t>Known weaknesses and expected failure cases.</w:t>
+      <w:proofErr w:type="gramStart"/>
+      <w:r>
+        <w:rPr>
+          <w:rFonts w:ascii="Calibri" w:hAnsi="Calibri"/>
+          <w:sz w:val="21"/>
+        </w:rPr>
+        <w:t>Known</w:t>
+      </w:r>
+      <w:proofErr w:type="gramEnd"/>
+      <w:r>
+        <w:rPr>
+          <w:rFonts w:ascii="Calibri" w:hAnsi="Calibri"/>
+          <w:sz w:val="21"/>
+        </w:rPr>
+        <w:t xml:space="preserve"> weaknesses and expected failure cases.</w:t>
       </w:r>
     </w:p>
     <w:p>
@@ -1375,7 +1865,23 @@
           <w:rFonts w:ascii="Calibri" w:hAnsi="Calibri"/>
           <w:sz w:val="21"/>
         </w:rPr>
-        <w:t>Toy twin can drift from any richer future connectors. Paraphrased or novel action types outside the ASA catalog may be missed.</w:t>
+        <w:t xml:space="preserve">Toy </w:t>
+      </w:r>
+      <w:proofErr w:type="gramStart"/>
+      <w:r>
+        <w:rPr>
+          <w:rFonts w:ascii="Calibri" w:hAnsi="Calibri"/>
+          <w:sz w:val="21"/>
+        </w:rPr>
+        <w:t>twin</w:t>
+      </w:r>
+      <w:proofErr w:type="gramEnd"/>
+      <w:r>
+        <w:rPr>
+          <w:rFonts w:ascii="Calibri" w:hAnsi="Calibri"/>
+          <w:sz w:val="21"/>
+        </w:rPr>
+        <w:t xml:space="preserve"> can drift from any richer future connectors. Paraphrased or novel action types outside the ASA catalog may be missed.</w:t>
       </w:r>
     </w:p>
     <w:p>

</xml_diff>

<commit_message>
Add What worked section and clarify README reproduction steps
</commit_message>
<xml_diff>
--- a/docs/CSE598-Project-Janus-Proposal.docx
+++ b/docs/CSE598-Project-Janus-Proposal.docx
@@ -1300,6 +1300,28 @@
           <w:sz w:val="18"/>
         </w:rPr>
         <w:t>.</w:t>
+      </w:r>
+    </w:p>
+    <w:p>
+      <w:r>
+        <w:rPr>
+          <w:rFonts w:ascii="Calibri" w:hAnsi="Calibri"/>
+          <w:b/>
+          <w:sz w:val="21"/>
+        </w:rPr>
+        <w:t>What worked.</w:t>
+      </w:r>
+    </w:p>
+    <w:p>
+      <w:pPr>
+        <w:pStyle w:val="ListBullet"/>
+      </w:pPr>
+      <w:r>
+        <w:rPr>
+          <w:rFonts w:ascii="Calibri" w:hAnsi="Calibri"/>
+          <w:sz w:val="21"/>
+        </w:rPr>
+        <w:t>Secret token was redacted ([REDACTED]). Twin ready. ASA broke the shadow. Four defenses were designed and validated.</w:t>
       </w:r>
     </w:p>
     <w:p>

</xml_diff>